<commit_message>
docs: remove stale qr scanner references
</commit_message>
<xml_diff>
--- a/PCIC_RO10_Technical_Documentation_v1.4.1.docx
+++ b/PCIC_RO10_Technical_Documentation_v1.4.1.docx
@@ -5756,7 +5756,172 @@
         <w:pStyle w:val="Heading1"/>
       </w:pPr>
       <w:r>
-        <w:t>12. Troubleshooting Guide</w:t>
+        <w:t>12. Technical Deep Dives</w:t>
+      </w:r>
+    </w:p>
+    <w:p/>
+    <w:p>
+      <w:r>
+        <w:t>This section provides granular technical details on the application's internal systems to assist future developers in maintenance and troubleshooting.</w:t>
+      </w:r>
+    </w:p>
+    <w:p/>
+    <w:p>
+      <w:pPr>
+        <w:pStyle w:val="Heading2"/>
+      </w:pPr>
+      <w:r>
+        <w:t>12.1 State Persistence Engine</w:t>
+      </w:r>
+    </w:p>
+    <w:p>
+      <w:r>
+        <w:t>The application uses a "Safety First" persistence model to prevent data loss during hardware failures or accidental browser closures (common in field use).</w:t>
+      </w:r>
+    </w:p>
+    <w:p>
+      <w:pPr>
+        <w:pStyle w:val="ListBullet"/>
+      </w:pPr>
+      <w:r>
+        <w:t>**Auto-Save:** The function `saveEnrollmentState()` is triggered on every view transition and step change.</w:t>
+      </w:r>
+    </w:p>
+    <w:p>
+      <w:pPr>
+        <w:pStyle w:val="ListBullet"/>
+      </w:pPr>
+      <w:r>
+        <w:t>**dual-layer Storage:**</w:t>
+      </w:r>
+    </w:p>
+    <w:p>
+      <w:pPr>
+        <w:pStyle w:val="ListBullet"/>
+      </w:pPr>
+      <w:r>
+        <w:t>`localStorage`: Stores the current "in-progress" enrollment data (keys: `pcic_current_farmer`, `pcic_current_history`). This acts as a volatile cache.</w:t>
+      </w:r>
+    </w:p>
+    <w:p>
+      <w:pPr>
+        <w:pStyle w:val="ListBullet"/>
+      </w:pPr>
+      <w:r>
+        <w:t>`IndexedDB (Dexie)`: Stores finalized applications and imported master data.</w:t>
+      </w:r>
+    </w:p>
+    <w:p>
+      <w:pPr>
+        <w:pStyle w:val="ListBullet"/>
+      </w:pPr>
+      <w:r>
+        <w:t>**Workflow Recovery:** On launch, the app checks `pcic_enrollment_active`. If `true`, it bypasses the dashboard and restores the form state from `localStorage` immediately.</w:t>
+      </w:r>
+    </w:p>
+    <w:p/>
+    <w:p>
+      <w:pPr>
+        <w:pStyle w:val="Heading2"/>
+      </w:pPr>
+      <w:r>
+        <w:t>12.2 PDF Coordinate Mapping System</w:t>
+      </w:r>
+    </w:p>
+    <w:p>
+      <w:r>
+        <w:t>Unlike traditional PDF generators that use absolute pixel positions, this app uses a normalized percentage-based coordinate system (0.0 to 100.0).</w:t>
+      </w:r>
+    </w:p>
+    <w:p>
+      <w:pPr>
+        <w:pStyle w:val="ListBullet"/>
+      </w:pPr>
+      <w:r>
+        <w:t>**Mapping Logic:** In `generateIndividualPDF()`, coordinates are converted to millimeters at runtime: `xMM = (cfg.x / 100) * 210`.</w:t>
+      </w:r>
+    </w:p>
+    <w:p>
+      <w:pPr>
+        <w:pStyle w:val="ListBullet"/>
+      </w:pPr>
+      <w:r>
+        <w:t>**Dynamic Calibration:** The "PDF Calibration" tool in Settings allows an admin to drag-and-drop labels on a canvas. These positions are saved as a JSON object in `db.settings`, overriding the hardcoded `DEFAULT_CONFIGS`. This allows supporting new form versions without modifying the source code.</w:t>
+      </w:r>
+    </w:p>
+    <w:p/>
+    <w:p>
+      <w:pPr>
+        <w:pStyle w:val="Heading2"/>
+      </w:pPr>
+      <w:r>
+        <w:t>12.3 Signature Scaling &amp; Resilience</w:t>
+      </w:r>
+    </w:p>
+    <w:p>
+      <w:r>
+        <w:t>To ensure signatures remain clear across different screen sizes (phones vs. large tablets) and rotations:</w:t>
+      </w:r>
+    </w:p>
+    <w:p>
+      <w:pPr>
+        <w:pStyle w:val="ListBullet"/>
+      </w:pPr>
+      <w:r>
+        <w:t>**Ratio-Aware:** The `resizeCanvas()` function calculates the `devicePixelRatio` to ensure the canvas drawing buffer matches the physical screen resolution.</w:t>
+      </w:r>
+    </w:p>
+    <w:p>
+      <w:pPr>
+        <w:pStyle w:val="ListBullet"/>
+      </w:pPr>
+      <w:r>
+        <w:t>**Data Preservation:** Before a canvas is resized (e.g., when toggling "Full Screen" mode), the vector points of the signature are captured via `toData()`. After the resize, the points are mathematically scaled to the new dimensions and re-rendered via `fromData()`, preventing the signature from becoming "lost" or "stretched."</w:t>
+      </w:r>
+    </w:p>
+    <w:p/>
+    <w:p>
+      <w:pPr>
+        <w:pStyle w:val="Heading2"/>
+      </w:pPr>
+      <w:r>
+        <w:t>12.4 Insurance Line UI Switching</w:t>
+      </w:r>
+    </w:p>
+    <w:p>
+      <w:r>
+        <w:t>The `toggleInsuranceView()` function reconfigures the Single-Page Application (SPA) dynamically:</w:t>
+      </w:r>
+    </w:p>
+    <w:p>
+      <w:pPr>
+        <w:pStyle w:val="ListBullet"/>
+      </w:pPr>
+      <w:r>
+        <w:t>**DOM Filtering:** It hides/shows sections based on the `f_insurance_line` value.</w:t>
+      </w:r>
+    </w:p>
+    <w:p>
+      <w:pPr>
+        <w:pStyle w:val="ListBullet"/>
+      </w:pPr>
+      <w:r>
+        <w:t>**Validation Branching:** The `finalizeApplication()` function uses a conditional validation engine that selects which `requiredFields` array to check based on the active insurance line, ensuring users aren't prompted for "Banca" data while enrolling a "Rice" crop.</w:t>
+      </w:r>
+    </w:p>
+    <w:p/>
+    <w:p>
+      <w:r>
+        <w:t>---</w:t>
+      </w:r>
+    </w:p>
+    <w:p/>
+    <w:p>
+      <w:pPr>
+        <w:pStyle w:val="Heading1"/>
+      </w:pPr>
+      <w:r>
+        <w:t>13. Troubleshooting Guide</w:t>
       </w:r>
     </w:p>
     <w:p/>
@@ -6436,7 +6601,7 @@
     <w:p/>
     <w:p>
       <w:r>
-        <w:t>This document was generated based on the codebase as of version 1.4.1 (March 18, 2026). Update this document whenever significant architectural changes are made.</w:t>
+        <w:t>This document was generated based on the codebase as of version 1.4.1 (March 18, 2026).</w:t>
       </w:r>
     </w:p>
     <w:sectPr>

</xml_diff>